<commit_message>
Alterações e avanços na documentação
</commit_message>
<xml_diff>
--- a/[Documentos]/Terceira Entrega/[Matemática]/Grupo 2 - Matemática Discreta - Aqua Point.docx
+++ b/[Documentos]/Terceira Entrega/[Matemática]/Grupo 2 - Matemática Discreta - Aqua Point.docx
@@ -406,7 +406,7 @@
           <w:szCs w:val="20"/>
         </w:rPr>
       </w:pPr>
-      <w:bookmarkStart w:id="0" w:name="_Toc216300459"/>
+      <w:bookmarkStart w:id="0" w:name="_Toc216360227"/>
       <w:r>
         <w:t>INDICE</w:t>
       </w:r>
@@ -465,7 +465,7 @@
           <w:r>
             <w:fldChar w:fldCharType="separate"/>
           </w:r>
-          <w:hyperlink w:anchor="_Toc216300459" w:history="1">
+          <w:hyperlink w:anchor="_Toc216360227" w:history="1">
             <w:r>
               <w:rPr>
                 <w:rStyle w:val="Hiperligao"/>
@@ -492,7 +492,7 @@
                 <w:noProof/>
                 <w:webHidden/>
               </w:rPr>
-              <w:instrText xml:space="preserve"> PAGEREF _Toc216300459 \h </w:instrText>
+              <w:instrText xml:space="preserve"> PAGEREF _Toc216360227 \h </w:instrText>
             </w:r>
             <w:r>
               <w:rPr>
@@ -539,7 +539,7 @@
               <w:lang w:eastAsia="pt-PT"/>
             </w:rPr>
           </w:pPr>
-          <w:hyperlink w:anchor="_Toc216300460" w:history="1">
+          <w:hyperlink w:anchor="_Toc216360228" w:history="1">
             <w:r>
               <w:rPr>
                 <w:rStyle w:val="Hiperligao"/>
@@ -566,7 +566,7 @@
                 <w:noProof/>
                 <w:webHidden/>
               </w:rPr>
-              <w:instrText xml:space="preserve"> PAGEREF _Toc216300460 \h </w:instrText>
+              <w:instrText xml:space="preserve"> PAGEREF _Toc216360228 \h </w:instrText>
             </w:r>
             <w:r>
               <w:rPr>
@@ -613,7 +613,7 @@
               <w:lang w:eastAsia="pt-PT"/>
             </w:rPr>
           </w:pPr>
-          <w:hyperlink w:anchor="_Toc216300461" w:history="1">
+          <w:hyperlink w:anchor="_Toc216360229" w:history="1">
             <w:r>
               <w:rPr>
                 <w:rStyle w:val="Hiperligao"/>
@@ -640,7 +640,7 @@
                 <w:noProof/>
                 <w:webHidden/>
               </w:rPr>
-              <w:instrText xml:space="preserve"> PAGEREF _Toc216300461 \h </w:instrText>
+              <w:instrText xml:space="preserve"> PAGEREF _Toc216360229 \h </w:instrText>
             </w:r>
             <w:r>
               <w:rPr>
@@ -687,7 +687,7 @@
               <w:lang w:eastAsia="pt-PT"/>
             </w:rPr>
           </w:pPr>
-          <w:hyperlink w:anchor="_Toc216300462" w:history="1">
+          <w:hyperlink w:anchor="_Toc216360230" w:history="1">
             <w:r>
               <w:rPr>
                 <w:rStyle w:val="Hiperligao"/>
@@ -714,7 +714,7 @@
                 <w:noProof/>
                 <w:webHidden/>
               </w:rPr>
-              <w:instrText xml:space="preserve"> PAGEREF _Toc216300462 \h </w:instrText>
+              <w:instrText xml:space="preserve"> PAGEREF _Toc216360230 \h </w:instrText>
             </w:r>
             <w:r>
               <w:rPr>
@@ -761,12 +761,86 @@
               <w:lang w:eastAsia="pt-PT"/>
             </w:rPr>
           </w:pPr>
-          <w:hyperlink w:anchor="_Toc216300463" w:history="1">
+          <w:hyperlink w:anchor="_Toc216360231" w:history="1">
             <w:r>
               <w:rPr>
                 <w:rStyle w:val="Hiperligao"/>
                 <w:noProof/>
               </w:rPr>
+              <w:t>O OBJETIVO</w:t>
+            </w:r>
+            <w:r>
+              <w:rPr>
+                <w:noProof/>
+                <w:webHidden/>
+              </w:rPr>
+              <w:tab/>
+            </w:r>
+            <w:r>
+              <w:rPr>
+                <w:noProof/>
+                <w:webHidden/>
+              </w:rPr>
+              <w:fldChar w:fldCharType="begin"/>
+            </w:r>
+            <w:r>
+              <w:rPr>
+                <w:noProof/>
+                <w:webHidden/>
+              </w:rPr>
+              <w:instrText xml:space="preserve"> PAGEREF _Toc216360231 \h </w:instrText>
+            </w:r>
+            <w:r>
+              <w:rPr>
+                <w:noProof/>
+                <w:webHidden/>
+              </w:rPr>
+            </w:r>
+            <w:r>
+              <w:rPr>
+                <w:noProof/>
+                <w:webHidden/>
+              </w:rPr>
+              <w:fldChar w:fldCharType="separate"/>
+            </w:r>
+            <w:r>
+              <w:rPr>
+                <w:noProof/>
+                <w:webHidden/>
+              </w:rPr>
+              <w:t>4</w:t>
+            </w:r>
+            <w:r>
+              <w:rPr>
+                <w:noProof/>
+                <w:webHidden/>
+              </w:rPr>
+              <w:fldChar w:fldCharType="end"/>
+            </w:r>
+          </w:hyperlink>
+        </w:p>
+        <w:p>
+          <w:pPr>
+            <w:pStyle w:val="ndice1"/>
+            <w:tabs>
+              <w:tab w:val="right" w:leader="dot" w:pos="8494"/>
+            </w:tabs>
+            <w:rPr>
+              <w:rFonts w:eastAsiaTheme="minorEastAsia" w:cstheme="minorBidi"/>
+              <w:b w:val="0"/>
+              <w:bCs w:val="0"/>
+              <w:i w:val="0"/>
+              <w:iCs w:val="0"/>
+              <w:noProof/>
+              <w:lang w:eastAsia="pt-PT"/>
+            </w:rPr>
+          </w:pPr>
+          <w:hyperlink w:anchor="_Toc216360232" w:history="1">
+            <w:r>
+              <w:rPr>
+                <w:rStyle w:val="Hiperligao"/>
+                <w:noProof/>
+              </w:rPr>
               <w:t>INTEGRAÇÃO COM MATEMÁTICA DISCRETA</w:t>
             </w:r>
             <w:r>
@@ -788,7 +862,7 @@
                 <w:noProof/>
                 <w:webHidden/>
               </w:rPr>
-              <w:instrText xml:space="preserve"> PAGEREF _Toc216300463 \h </w:instrText>
+              <w:instrText xml:space="preserve"> PAGEREF _Toc216360232 \h </w:instrText>
             </w:r>
             <w:r>
               <w:rPr>
@@ -808,7 +882,7 @@
                 <w:noProof/>
                 <w:webHidden/>
               </w:rPr>
-              <w:t>4</w:t>
+              <w:t>5</w:t>
             </w:r>
             <w:r>
               <w:rPr>
@@ -876,7 +950,7 @@
         <w:pStyle w:val="Ttulo1"/>
       </w:pPr>
       <w:bookmarkStart w:id="1" w:name="_Toc180414465"/>
-      <w:bookmarkStart w:id="2" w:name="_Toc216300460"/>
+      <w:bookmarkStart w:id="2" w:name="_Toc216360228"/>
       <w:r>
         <w:lastRenderedPageBreak/>
         <w:t>INTRODUÇÃO</w:t>
@@ -891,6 +965,7 @@
           <w:sz w:val="24"/>
         </w:rPr>
       </w:pPr>
+      <w:proofErr w:type="spellStart"/>
       <w:r>
         <w:rPr>
           <w:rFonts w:cs="Arial"/>
@@ -898,8 +973,29 @@
           <w:bCs/>
           <w:sz w:val="24"/>
         </w:rPr>
-        <w:t>Aqua Point</w:t>
-      </w:r>
+        <w:t>Aqua</w:t>
+      </w:r>
+      <w:proofErr w:type="spellEnd"/>
+      <w:r>
+        <w:rPr>
+          <w:rFonts w:cs="Arial"/>
+          <w:b/>
+          <w:bCs/>
+          <w:sz w:val="24"/>
+        </w:rPr>
+        <w:t xml:space="preserve"> </w:t>
+      </w:r>
+      <w:proofErr w:type="spellStart"/>
+      <w:r>
+        <w:rPr>
+          <w:rFonts w:cs="Arial"/>
+          <w:b/>
+          <w:bCs/>
+          <w:sz w:val="24"/>
+        </w:rPr>
+        <w:t>Point</w:t>
+      </w:r>
+      <w:proofErr w:type="spellEnd"/>
       <w:r>
         <w:rPr>
           <w:rFonts w:cs="Arial"/>
@@ -964,7 +1060,7 @@
       <w:pPr>
         <w:pStyle w:val="Ttulo1"/>
       </w:pPr>
-      <w:bookmarkStart w:id="3" w:name="_Toc216300461"/>
+      <w:bookmarkStart w:id="3" w:name="_Toc216360229"/>
       <w:r>
         <w:t xml:space="preserve">O </w:t>
       </w:r>
@@ -988,6 +1084,7 @@
         </w:rPr>
         <w:t xml:space="preserve">A ideia da aplicação </w:t>
       </w:r>
+      <w:proofErr w:type="spellStart"/>
       <w:r>
         <w:rPr>
           <w:rFonts w:cs="Arial"/>
@@ -995,28 +1092,35 @@
           <w:bCs/>
           <w:sz w:val="24"/>
         </w:rPr>
-        <w:t>Aqua Point</w:t>
-      </w:r>
-      <w:r>
-        <w:rPr>
-          <w:rFonts w:cs="Arial"/>
+        <w:t>Aqua</w:t>
+      </w:r>
+      <w:proofErr w:type="spellEnd"/>
+      <w:r>
+        <w:rPr>
+          <w:rFonts w:cs="Arial"/>
+          <w:b/>
+          <w:bCs/>
           <w:sz w:val="24"/>
         </w:rPr>
-        <w:t xml:space="preserve">, surgiu de um problema, </w:t>
-      </w:r>
-      <w:r>
-        <w:rPr>
-          <w:rFonts w:cs="Arial"/>
+        <w:t xml:space="preserve"> </w:t>
+      </w:r>
+      <w:proofErr w:type="spellStart"/>
+      <w:r>
+        <w:rPr>
+          <w:rFonts w:cs="Arial"/>
+          <w:b/>
+          <w:bCs/>
           <w:sz w:val="24"/>
         </w:rPr>
-        <w:t>sendo ele</w:t>
-      </w:r>
+        <w:t>Point</w:t>
+      </w:r>
+      <w:proofErr w:type="spellEnd"/>
       <w:r>
         <w:rPr>
           <w:rFonts w:cs="Arial"/>
           <w:sz w:val="24"/>
         </w:rPr>
-        <w:t xml:space="preserve"> a falta de bebedouros funcionais perto de cada utilizador.</w:t>
+        <w:t>, surgiu de um problema, cujo é a falta de bebedouros funcionais perto de cada utilizador.</w:t>
       </w:r>
     </w:p>
     <w:p>
@@ -1046,12 +1150,28 @@
     </w:p>
     <w:p>
       <w:pPr>
-        <w:spacing w:before="0" w:after="0" w:line="240" w:lineRule="auto"/>
-        <w:rPr>
-          <w:rFonts w:ascii="Times New Roman" w:hAnsi="Times New Roman"/>
+        <w:spacing w:before="0" w:after="0"/>
+        <w:rPr>
+          <w:rFonts w:cs="Arial"/>
           <w:sz w:val="24"/>
         </w:rPr>
       </w:pPr>
+    </w:p>
+    <w:p>
+      <w:pPr>
+        <w:spacing w:before="0" w:after="0"/>
+        <w:rPr>
+          <w:rFonts w:cs="Arial"/>
+          <w:sz w:val="24"/>
+        </w:rPr>
+      </w:pPr>
+      <w:r>
+        <w:rPr>
+          <w:rFonts w:cs="Arial"/>
+          <w:sz w:val="24"/>
+        </w:rPr>
+        <w:t>A criação dessa aplicação visa resolver esses problemas, entregando ao utilizador uma listagem de bebedouros por perto, assim como a apresentação de opiniões e críticas adicionadas por outros utilizadores e ainda a possibilidade de verificar de forma rápida se o bebedouro está funcional ou não.</w:t>
+      </w:r>
     </w:p>
     <w:p>
       <w:pPr>
@@ -1067,7 +1187,7 @@
       <w:pPr>
         <w:pStyle w:val="Ttulo1"/>
       </w:pPr>
-      <w:bookmarkStart w:id="4" w:name="_Toc216300462"/>
+      <w:bookmarkStart w:id="4" w:name="_Toc216360230"/>
       <w:r>
         <w:t>A SOLUÇÃO</w:t>
       </w:r>
@@ -1115,12 +1235,98 @@
       <w:pPr>
         <w:pStyle w:val="Ttulo1"/>
       </w:pPr>
-      <w:bookmarkStart w:id="5" w:name="_Toc216300463"/>
+      <w:bookmarkStart w:id="5" w:name="_Toc216360231"/>
+      <w:r>
+        <w:lastRenderedPageBreak/>
+        <w:t>O OBJETIVO</w:t>
+      </w:r>
+      <w:bookmarkEnd w:id="5"/>
+    </w:p>
+    <w:p>
+      <w:pPr>
+        <w:rPr>
+          <w:sz w:val="24"/>
+        </w:rPr>
+      </w:pPr>
+      <w:r>
+        <w:rPr>
+          <w:sz w:val="24"/>
+        </w:rPr>
+        <w:t>O objetivo desta aplicação é sobretudo fornecer ao utilizador um meio de saciar a sua sede e até mesmo evitar que tenha de fazer caminhadas extensas para chegar a um bebedouro que no final de contas, não funciona ou está em péssimas condições, seja na qualidade da água, ou até mesmo a limpeza do mesmo.</w:t>
+      </w:r>
+    </w:p>
+    <w:p>
+      <w:pPr>
+        <w:spacing w:before="0" w:after="0"/>
+        <w:rPr>
+          <w:rFonts w:cs="Arial"/>
+          <w:b/>
+          <w:bCs/>
+          <w:sz w:val="28"/>
+          <w:szCs w:val="28"/>
+        </w:rPr>
+      </w:pPr>
+      <w:r>
+        <w:rPr>
+          <w:sz w:val="24"/>
+        </w:rPr>
+        <w:t xml:space="preserve">Com o </w:t>
+      </w:r>
+      <w:proofErr w:type="spellStart"/>
+      <w:r>
+        <w:rPr>
+          <w:b/>
+          <w:bCs/>
+          <w:sz w:val="24"/>
+        </w:rPr>
+        <w:t>Aqua</w:t>
+      </w:r>
+      <w:proofErr w:type="spellEnd"/>
+      <w:r>
+        <w:rPr>
+          <w:b/>
+          <w:bCs/>
+          <w:sz w:val="24"/>
+        </w:rPr>
+        <w:t xml:space="preserve"> </w:t>
+      </w:r>
+      <w:proofErr w:type="spellStart"/>
+      <w:r>
+        <w:rPr>
+          <w:b/>
+          <w:bCs/>
+          <w:sz w:val="24"/>
+        </w:rPr>
+        <w:t>Point</w:t>
+      </w:r>
+      <w:proofErr w:type="spellEnd"/>
+      <w:r>
+        <w:rPr>
+          <w:sz w:val="24"/>
+        </w:rPr>
+        <w:t>, é possível verificar todos os bebedouros por perto, adicionar novos em caso de estarem em falta no mapa, adicionar opiniões relativas ao bebedouro sendo elas em prol da higiene ou até mesmo do funcionamento do dispositivo e além disso, conseguir gerir preferências pessoais no perfil da aplicação.</w:t>
+      </w:r>
+      <w:r>
+        <w:rPr>
+          <w:rFonts w:cs="Arial"/>
+          <w:b/>
+          <w:bCs/>
+          <w:sz w:val="28"/>
+          <w:szCs w:val="28"/>
+        </w:rPr>
+        <w:br w:type="page"/>
+      </w:r>
+    </w:p>
+    <w:p>
+      <w:pPr>
+        <w:pStyle w:val="Ttulo1"/>
+      </w:pPr>
+      <w:bookmarkStart w:id="6" w:name="_Toc216360232"/>
       <w:r>
         <w:lastRenderedPageBreak/>
         <w:t>INTEGRAÇÃO COM MATEMÁTICA DISCRETA</w:t>
       </w:r>
-      <w:bookmarkEnd w:id="5"/>
+      <w:bookmarkEnd w:id="6"/>
     </w:p>
     <w:p>
       <w:pPr>
@@ -1208,6 +1414,7 @@
         </w:rPr>
         <w:t xml:space="preserve">O código verifica o estado do bebedouro através da propriedade </w:t>
       </w:r>
+      <w:proofErr w:type="spellStart"/>
       <w:r>
         <w:rPr>
           <w:rFonts w:cs="Arial"/>
@@ -1218,6 +1425,7 @@
         </w:rPr>
         <w:t>state_id</w:t>
       </w:r>
+      <w:proofErr w:type="spellEnd"/>
       <w:r>
         <w:rPr>
           <w:rFonts w:cs="Arial"/>
@@ -1790,6 +1998,7 @@
         </w:rPr>
         <w:t xml:space="preserve"> foram preenchidos. Se sim, envia a </w:t>
       </w:r>
+      <w:proofErr w:type="spellStart"/>
       <w:r>
         <w:rPr>
           <w:rFonts w:cs="Arial"/>
@@ -1800,6 +2009,7 @@
         </w:rPr>
         <w:t>review</w:t>
       </w:r>
+      <w:proofErr w:type="spellEnd"/>
       <w:r>
         <w:rPr>
           <w:rFonts w:cs="Arial"/>
@@ -1808,6 +2018,7 @@
         </w:rPr>
         <w:t xml:space="preserve"> ao servidor, atualiza os dados locais e a lista de </w:t>
       </w:r>
+      <w:proofErr w:type="spellStart"/>
       <w:r>
         <w:rPr>
           <w:rFonts w:cs="Arial"/>
@@ -1818,6 +2029,7 @@
         </w:rPr>
         <w:t>reviews</w:t>
       </w:r>
+      <w:proofErr w:type="spellEnd"/>
       <w:r>
         <w:rPr>
           <w:rFonts w:cs="Arial"/>

</xml_diff>